<commit_message>
chore(thesis): finalize revisions and copy to project folder
</commit_message>
<xml_diff>
--- a/skripsi/drafts/MAKALAH SEMINAR AKUNTANSI_AJIE BARIANDONO_2110426823.docx
+++ b/skripsi/drafts/MAKALAH SEMINAR AKUNTANSI_AJIE BARIANDONO_2110426823.docx
@@ -1955,7 +1955,7 @@
           <w:szCs w:val="24"/>
         </w:rPr>
         <w:ptab w:alignment="right" w:relativeTo="margin" w:leader="dot"/>
-        <w:t xml:space="preserve">28</w:t>
+        <w:t xml:space="preserve">27</w:t>
       </w:r>
     </w:p>
     <w:p>
@@ -5196,7 +5196,7 @@
           <w:sz w:val="22"/>
           <w:szCs w:val="22"/>
         </w:rPr>
-        <w:t xml:space="preserve">*Rata-rata proporsi pagu Belanja Modal terhadap total pagu DIPA. **Rata-rata deviasi bulanan |RPD − Realisasi|/RPD Belanja Modal, sesuai basis perhitungan PER-5/PB/2024 Pasal 7. ***Nilai akhir tahun, seluruh jenis belanja. Sumber: OM-SPAN/MEBE, diolah peneliti (2026).</w:t>
+        <w:t xml:space="preserve">*Rata-rata proporsi pagu Belanja Modal terhadap total pagu DIPA. **Rata-rata deviasi bulanan |RPD − Realisasi|/RPD Belanja Modal, sesuai basis perhitungan PER-5/PB/2024 Pasal 7. ***Nilai akhir tahun, seluruh jenis belanja. Sumber: OM-SPAN/MEBE (Monitoring and Evaluation of Budget Execution), diolah peneliti (2026).</w:t>
       </w:r>
     </w:p>
     <w:p>
@@ -6679,7 +6679,7 @@
           <w:sz w:val="22"/>
           <w:szCs w:val="22"/>
         </w:rPr>
-        <w:t xml:space="preserve">Sumber: OM-SPAN/MEBE, diolah peneliti (2026).</w:t>
+        <w:t xml:space="preserve">Sumber: OM-SPAN/MEBE (Monitoring and Evaluation of Budget Execution), diolah peneliti (2026).</w:t>
       </w:r>
     </w:p>
     <w:p>
@@ -9735,7 +9735,7 @@
           <w:sz w:val="24"/>
           <w:szCs w:val="24"/>
         </w:rPr>
-        <w:t xml:space="preserve">Namun demikian, formulasi resmi penilaian IKPA berdasarkan PER-5/PB/2024 menggunakan nilai mutlak (absolut) dalam menghitung deviasi bulanan per jenis belanja. Melalui penggunaan nilai mutlak tersebut, formula IKPA tidak membedakan arah deviasi; baik terjadi </w:t>
+        <w:t xml:space="preserve">Namun demikian, formulasi resmi penilaian IKPA berdasarkan PER-5/PB/2024 menggunakan nilai mutlak (absolut) dalam menghitung deviasi bulanan per jenis belanja. Formula deviasi bulanan tersebut secara eksplisit dirumuskan sebagai berikut: Deviasi Bulanan = (|RPD Bulanan - Realisasi Anggaran| / RPD Bulanan) * 100%. Melalui penggunaan nilai mutlak tersebut, formula IKPA tidak membedakan arah deviasi; baik terjadi </w:t>
       </w:r>
       <w:r>
         <w:rPr>
@@ -10301,7 +10301,7 @@
           <w:sz w:val="24"/>
           <w:szCs w:val="24"/>
         </w:rPr>
-        <w:t xml:space="preserve">Penilaian IKPA mencakup tiga aspek, yaitu kualitas perencanaan, kualitas pelaksanaan, dan kualitas hasil, yang dioperasionalkan melalui tujuh indikator dengan bobot masing-masing: Revisi DIPA (5%), Deviasi Halaman III DIPA (15%), Penyerapan Anggaran (30%), Belanja Kontraktual (15%), Penyelesaian Tagihan (15%), Pengelolaan Uang Persediaan (5%), dan Capaian Output (15%) (PER-5/PB/2024). Indikator Deviasi Halaman III DIPA memiliki signifikansi khusus dalam penelitian ini karena mengukur akurasi perencanaan realisasi dana atas ketiga jenis belanja, termasuk Belanja Modal; deviasi dihitung sebagai persentase simpangan antara RPD dan realisasi aktual, sehingga semakin besar simpangan, semakin rendah nilai indikatornya.</w:t>
+        <w:t xml:space="preserve">Penilaian IKPA mencakup tiga aspek, yaitu kualitas perencanaan, kualitas pelaksanaan, dan kualitas hasil, yang dioperasionalkan melalui tujuh indikator dengan bobot masing-masing: Revisi DIPA (5%), Deviasi Halaman III DIPA (15%), Penyerapan Anggaran (30%), Belanja Kontraktual (15%), Penyelesaian Tagihan (15%), Pengelolaan Uang Persediaan (5%), dan Capaian Output (15%) (PER-5/PB/2024). Indikator Deviasi Halaman III DIPA memiliki signifikansi khusus dalam penelitian ini karena mengukur akurasi perencanaan realisasi dana atas ketiga jenis belanja, termasuk Belanja Modal; deviasi dihitung sebagai persentase simpangan antara RPD dan realisasi aktual dengan formula: Deviasi = (|Realisasi - RPD| / RPD) * 100%, sesuai Peraturan Dirjen Perbendaharaan Nomor PER-5/PB/2024. Semakin besar simpangan, semakin rendah nilai indikatornya.</w:t>
       </w:r>
     </w:p>
     <w:p>
@@ -11960,7 +11960,7 @@
           <w:sz w:val="24"/>
           <w:szCs w:val="24"/>
         </w:rPr>
-        <w:t xml:space="preserve">Penelitian ini dilaksanakan di Rumah Detensi Imigrasi (Rudenim) Pontianak, yang beralamat di Jalan Adi Sucipto KM. 15, Kabupaten Kubu Raya, Provinsi Kalimantan Barat. Rudenim Pontianak merupakan Unit Pelaksana Teknis (UPT) di bawah Direktorat Jenderal Imigrasi, Kementerian Imigrasi dan Pemasyarakatan (Perpres 139/2024), dengan kode satker 692965. Periode data yang dikaji mencakup Tahun Anggaran 2023, 2024, dan 2025, rentang tiga tahun yang memberikan variasi antar-tahun yang cukup untuk membedakan pola deviasi persisten dari anomali, serta mencakup periode transisi struktural kelembagaan. Data penelitian bersumber dari dua jenis: data primer yang diperoleh melalui </w:t>
+        <w:t xml:space="preserve">Penelitian ini dilaksanakan di Rumah Detensi Imigrasi (Rudenim) Pontianak, yang beralamat di Jalan Adi Sucipto KM. 15, Kabupaten Kubu Raya, Provinsi Kalimantan Barat. Rudenim Pontianak merupakan Unit Pelaksana Teknis (UPT) di bawah Direktorat Jenderal Imigrasi. Perlu dicatat bahwa selama periode penelitian, Rudenim Pontianak mengalami transisi kelembagaan: pada Tahun Anggaran 2023 dan 2024, satker ini berada di bawah Kementerian Hukum dan Hak Asasi Manusia (kode satker 664650), kemudian beralih ke Kementerian Imigrasi dan Pemasyarakatan (kode satker 692965) pada Tahun Anggaran 2025 seiring pembentukan kementerian baru berdasarkan Peraturan Presiden Nomor 139 Tahun 2024. Periode data yang dikaji mencakup Tahun Anggaran 2023, 2024, dan 2025, rentang tiga tahun yang memberikan variasi antar-tahun yang cukup untuk membedakan pola deviasi persisten dari anomali, serta mencakup periode transisi struktural kelembagaan. Data penelitian bersumber dari dua jenis: data primer yang diperoleh melalui </w:t>
       </w:r>
       <w:r>
         <w:rPr>
@@ -13073,13 +13073,32 @@
           <w:sz w:val="24"/>
           <w:szCs w:val="24"/>
         </w:rPr>
-        <w:t xml:space="preserve">Berdasarkan kriteria tersebut, teridentifikasi enam informan target yang disajikan pada Tabel 3.2.</w:t>
-      </w:r>
-    </w:p>
-    <w:p>
-      <w:pPr>
-        <w:spacing w:after="80" w:before="240" w:line="480"/>
-        <w:jc w:val="center"/>
+        <w:t xml:space="preserve">Secara operasional, pelaksanaan wawancara mendalam dilakukan secara semi-terstruktur dengan durasi berkisar antara 60 hingga 90 menit per sesi. Wawancara diselenggarakan di ruang tertutup pada kantor Rudenim Pontianak atau lokasi alternatif lain demi kenyamanan informan. Seluruh proses wawancara direkam menggunakan alat perekam audio atas persetujuan tertulis dari informan. Rekaman audio tersebut kemudian ditranskripsikan secara verbatim dalam Bahasa Indonesia dengan tetap mempertahankan istilah-istilah teknis penganggaran. Sebagai bentuk verifikasi keabsahan data (Lincoln &amp; Guba, 1985), transkrip hasil wawancara dikirimkan kembali kepada informan dalam waktu tujuh hari untuk dilakukan pengecekan ulang dan konfirmasi kebenarannya (</w:t>
+      </w:r>
+      <w:r>
+        <w:rPr>
+          <w:rFonts w:ascii="Times New Roman" w:cs="Times New Roman" w:eastAsia="Times New Roman" w:hAnsi="Times New Roman"/>
+          <w:i/>
+          <w:iCs/>
+          <w:sz w:val="24"/>
+          <w:szCs w:val="24"/>
+        </w:rPr>
+        <w:t xml:space="preserve">member check</w:t>
+      </w:r>
+      <w:r>
+        <w:rPr>
+          <w:rFonts w:ascii="Times New Roman" w:cs="Times New Roman" w:eastAsia="Times New Roman" w:hAnsi="Times New Roman"/>
+          <w:sz w:val="24"/>
+          <w:szCs w:val="24"/>
+        </w:rPr>
+        <w:t xml:space="preserve">).</w:t>
+      </w:r>
+    </w:p>
+    <w:p>
+      <w:pPr>
+        <w:pStyle w:val="Heading3"/>
+        <w:spacing w:after="160" w:before="240" w:line="480"/>
+        <w:jc w:val="left"/>
       </w:pPr>
       <w:r>
         <w:rPr>
@@ -13089,790 +13108,7 @@
           <w:sz w:val="24"/>
           <w:szCs w:val="24"/>
         </w:rPr>
-        <w:t xml:space="preserve">Tabel 3.2 Daftar Informan Target Penelitian</w:t>
-      </w:r>
-    </w:p>
-    <w:tbl>
-      <w:tblPr>
-        <w:tblW w:type="dxa" w:w="7937"/>
-        <w:tblBorders>
-          <w:top w:val="single" w:color="auto" w:sz="4"/>
-          <w:left w:val="single" w:color="auto" w:sz="4"/>
-          <w:bottom w:val="single" w:color="auto" w:sz="4"/>
-          <w:right w:val="single" w:color="auto" w:sz="4"/>
-          <w:insideH w:val="single" w:color="auto" w:sz="4"/>
-          <w:insideV w:val="single" w:color="auto" w:sz="4"/>
-        </w:tblBorders>
-      </w:tblPr>
-      <w:tblGrid>
-        <w:gridCol w:w="800"/>
-        <w:gridCol w:w="2500"/>
-        <w:gridCol w:w="5366"/>
-      </w:tblGrid>
-      <w:tr>
-        <w:tc>
-          <w:tcPr>
-            <w:tcW w:type="dxa" w:w="800"/>
-            <w:tcBorders>
-              <w:top w:val="single" w:color="000000" w:sz="4"/>
-              <w:left w:val="single" w:color="000000" w:sz="4"/>
-              <w:bottom w:val="single" w:color="000000" w:sz="4"/>
-              <w:right w:val="single" w:color="000000" w:sz="4"/>
-            </w:tcBorders>
-            <w:tcMar>
-              <w:top w:type="dxa" w:w="60"/>
-              <w:left w:type="dxa" w:w="120"/>
-              <w:bottom w:type="dxa" w:w="60"/>
-              <w:right w:type="dxa" w:w="120"/>
-            </w:tcMar>
-          </w:tcPr>
-          <w:p>
-            <w:pPr>
-              <w:spacing w:after="0" w:before="0" w:line="360"/>
-              <w:jc w:val="center"/>
-            </w:pPr>
-            <w:r>
-              <w:rPr>
-                <w:rFonts w:ascii="Times New Roman" w:cs="Times New Roman" w:eastAsia="Times New Roman" w:hAnsi="Times New Roman"/>
-                <w:b/>
-                <w:bCs/>
-                <w:i w:val="false"/>
-                <w:iCs w:val="false"/>
-                <w:sz w:val="22"/>
-                <w:szCs w:val="22"/>
-              </w:rPr>
-              <w:t xml:space="preserve">Kode</w:t>
-            </w:r>
-          </w:p>
-        </w:tc>
-        <w:tc>
-          <w:tcPr>
-            <w:tcW w:type="dxa" w:w="2500"/>
-            <w:tcBorders>
-              <w:top w:val="single" w:color="000000" w:sz="4"/>
-              <w:left w:val="single" w:color="000000" w:sz="4"/>
-              <w:bottom w:val="single" w:color="000000" w:sz="4"/>
-              <w:right w:val="single" w:color="000000" w:sz="4"/>
-            </w:tcBorders>
-            <w:tcMar>
-              <w:top w:type="dxa" w:w="60"/>
-              <w:left w:type="dxa" w:w="120"/>
-              <w:bottom w:type="dxa" w:w="60"/>
-              <w:right w:type="dxa" w:w="120"/>
-            </w:tcMar>
-          </w:tcPr>
-          <w:p>
-            <w:pPr>
-              <w:spacing w:after="0" w:before="0" w:line="360"/>
-              <w:jc w:val="center"/>
-            </w:pPr>
-            <w:r>
-              <w:rPr>
-                <w:rFonts w:ascii="Times New Roman" w:cs="Times New Roman" w:eastAsia="Times New Roman" w:hAnsi="Times New Roman"/>
-                <w:b/>
-                <w:bCs/>
-                <w:i w:val="false"/>
-                <w:iCs w:val="false"/>
-                <w:sz w:val="22"/>
-                <w:szCs w:val="22"/>
-              </w:rPr>
-              <w:t xml:space="preserve">Posisi/Jabatan</w:t>
-            </w:r>
-          </w:p>
-        </w:tc>
-        <w:tc>
-          <w:tcPr>
-            <w:tcW w:type="dxa" w:w="5366"/>
-            <w:tcBorders>
-              <w:top w:val="single" w:color="000000" w:sz="4"/>
-              <w:left w:val="single" w:color="000000" w:sz="4"/>
-              <w:bottom w:val="single" w:color="000000" w:sz="4"/>
-              <w:right w:val="single" w:color="000000" w:sz="4"/>
-            </w:tcBorders>
-            <w:tcMar>
-              <w:top w:type="dxa" w:w="60"/>
-              <w:left w:type="dxa" w:w="120"/>
-              <w:bottom w:type="dxa" w:w="60"/>
-              <w:right w:type="dxa" w:w="120"/>
-            </w:tcMar>
-          </w:tcPr>
-          <w:p>
-            <w:pPr>
-              <w:spacing w:after="0" w:before="0" w:line="360"/>
-              <w:jc w:val="center"/>
-            </w:pPr>
-            <w:r>
-              <w:rPr>
-                <w:rFonts w:ascii="Times New Roman" w:cs="Times New Roman" w:eastAsia="Times New Roman" w:hAnsi="Times New Roman"/>
-                <w:b/>
-                <w:bCs/>
-                <w:i w:val="false"/>
-                <w:iCs w:val="false"/>
-                <w:sz w:val="22"/>
-                <w:szCs w:val="22"/>
-              </w:rPr>
-              <w:t xml:space="preserve">Justifikasi Keterlibatan</w:t>
-            </w:r>
-          </w:p>
-        </w:tc>
-      </w:tr>
-      <w:tr>
-        <w:tc>
-          <w:tcPr>
-            <w:tcW w:type="dxa" w:w="800"/>
-            <w:tcBorders>
-              <w:top w:val="single" w:color="000000" w:sz="4"/>
-              <w:left w:val="single" w:color="000000" w:sz="4"/>
-              <w:bottom w:val="single" w:color="000000" w:sz="4"/>
-              <w:right w:val="single" w:color="000000" w:sz="4"/>
-            </w:tcBorders>
-            <w:tcMar>
-              <w:top w:type="dxa" w:w="60"/>
-              <w:left w:type="dxa" w:w="120"/>
-              <w:bottom w:type="dxa" w:w="60"/>
-              <w:right w:type="dxa" w:w="120"/>
-            </w:tcMar>
-          </w:tcPr>
-          <w:p>
-            <w:pPr>
-              <w:spacing w:after="0" w:before="0" w:line="360"/>
-              <w:jc w:val="left"/>
-            </w:pPr>
-            <w:r>
-              <w:rPr>
-                <w:rFonts w:ascii="Times New Roman" w:cs="Times New Roman" w:eastAsia="Times New Roman" w:hAnsi="Times New Roman"/>
-                <w:b w:val="false"/>
-                <w:bCs w:val="false"/>
-                <w:i w:val="false"/>
-                <w:iCs w:val="false"/>
-                <w:sz w:val="22"/>
-                <w:szCs w:val="22"/>
-              </w:rPr>
-              <w:t xml:space="preserve">KPA</w:t>
-            </w:r>
-          </w:p>
-        </w:tc>
-        <w:tc>
-          <w:tcPr>
-            <w:tcW w:type="dxa" w:w="2500"/>
-            <w:tcBorders>
-              <w:top w:val="single" w:color="000000" w:sz="4"/>
-              <w:left w:val="single" w:color="000000" w:sz="4"/>
-              <w:bottom w:val="single" w:color="000000" w:sz="4"/>
-              <w:right w:val="single" w:color="000000" w:sz="4"/>
-            </w:tcBorders>
-            <w:tcMar>
-              <w:top w:type="dxa" w:w="60"/>
-              <w:left w:type="dxa" w:w="120"/>
-              <w:bottom w:type="dxa" w:w="60"/>
-              <w:right w:type="dxa" w:w="120"/>
-            </w:tcMar>
-          </w:tcPr>
-          <w:p>
-            <w:pPr>
-              <w:spacing w:after="0" w:before="0" w:line="360"/>
-              <w:jc w:val="left"/>
-            </w:pPr>
-            <w:r>
-              <w:rPr>
-                <w:rFonts w:ascii="Times New Roman" w:cs="Times New Roman" w:eastAsia="Times New Roman" w:hAnsi="Times New Roman"/>
-                <w:b w:val="false"/>
-                <w:bCs w:val="false"/>
-                <w:i w:val="false"/>
-                <w:iCs w:val="false"/>
-                <w:sz w:val="22"/>
-                <w:szCs w:val="22"/>
-              </w:rPr>
-              <w:t xml:space="preserve">Kuasa Pengguna Anggaran (Kepala Rudenim Pontianak)</w:t>
-            </w:r>
-          </w:p>
-        </w:tc>
-        <w:tc>
-          <w:tcPr>
-            <w:tcW w:type="dxa" w:w="5366"/>
-            <w:tcBorders>
-              <w:top w:val="single" w:color="000000" w:sz="4"/>
-              <w:left w:val="single" w:color="000000" w:sz="4"/>
-              <w:bottom w:val="single" w:color="000000" w:sz="4"/>
-              <w:right w:val="single" w:color="000000" w:sz="4"/>
-            </w:tcBorders>
-            <w:tcMar>
-              <w:top w:type="dxa" w:w="60"/>
-              <w:left w:type="dxa" w:w="120"/>
-              <w:bottom w:type="dxa" w:w="60"/>
-              <w:right w:type="dxa" w:w="120"/>
-            </w:tcMar>
-          </w:tcPr>
-          <w:p>
-            <w:pPr>
-              <w:spacing w:after="0" w:before="0" w:line="360"/>
-              <w:jc w:val="left"/>
-            </w:pPr>
-            <w:r>
-              <w:rPr>
-                <w:rFonts w:ascii="Times New Roman" w:cs="Times New Roman" w:eastAsia="Times New Roman" w:hAnsi="Times New Roman"/>
-                <w:b w:val="false"/>
-                <w:bCs w:val="false"/>
-                <w:i w:val="false"/>
-                <w:iCs w:val="false"/>
-                <w:sz w:val="22"/>
-                <w:szCs w:val="22"/>
-              </w:rPr>
-              <w:t xml:space="preserve">Otoritas tertinggi pengelolaan anggaran satker; penetapan DIPA dan RPD; perspektif strategis pelaksanaan Belanja Modal</w:t>
-            </w:r>
-          </w:p>
-        </w:tc>
-      </w:tr>
-      <w:tr>
-        <w:tc>
-          <w:tcPr>
-            <w:tcW w:type="dxa" w:w="800"/>
-            <w:tcBorders>
-              <w:top w:val="single" w:color="000000" w:sz="4"/>
-              <w:left w:val="single" w:color="000000" w:sz="4"/>
-              <w:bottom w:val="single" w:color="000000" w:sz="4"/>
-              <w:right w:val="single" w:color="000000" w:sz="4"/>
-            </w:tcBorders>
-            <w:tcMar>
-              <w:top w:type="dxa" w:w="60"/>
-              <w:left w:type="dxa" w:w="120"/>
-              <w:bottom w:type="dxa" w:w="60"/>
-              <w:right w:type="dxa" w:w="120"/>
-            </w:tcMar>
-          </w:tcPr>
-          <w:p>
-            <w:pPr>
-              <w:spacing w:after="0" w:before="0" w:line="360"/>
-              <w:jc w:val="left"/>
-            </w:pPr>
-            <w:r>
-              <w:rPr>
-                <w:rFonts w:ascii="Times New Roman" w:cs="Times New Roman" w:eastAsia="Times New Roman" w:hAnsi="Times New Roman"/>
-                <w:b w:val="false"/>
-                <w:bCs w:val="false"/>
-                <w:i w:val="false"/>
-                <w:iCs w:val="false"/>
-                <w:sz w:val="22"/>
-                <w:szCs w:val="22"/>
-              </w:rPr>
-              <w:t xml:space="preserve">PPK</w:t>
-            </w:r>
-          </w:p>
-        </w:tc>
-        <w:tc>
-          <w:tcPr>
-            <w:tcW w:type="dxa" w:w="2500"/>
-            <w:tcBorders>
-              <w:top w:val="single" w:color="000000" w:sz="4"/>
-              <w:left w:val="single" w:color="000000" w:sz="4"/>
-              <w:bottom w:val="single" w:color="000000" w:sz="4"/>
-              <w:right w:val="single" w:color="000000" w:sz="4"/>
-            </w:tcBorders>
-            <w:tcMar>
-              <w:top w:type="dxa" w:w="60"/>
-              <w:left w:type="dxa" w:w="120"/>
-              <w:bottom w:type="dxa" w:w="60"/>
-              <w:right w:type="dxa" w:w="120"/>
-            </w:tcMar>
-          </w:tcPr>
-          <w:p>
-            <w:pPr>
-              <w:spacing w:after="0" w:before="0" w:line="360"/>
-              <w:jc w:val="left"/>
-            </w:pPr>
-            <w:r>
-              <w:rPr>
-                <w:rFonts w:ascii="Times New Roman" w:cs="Times New Roman" w:eastAsia="Times New Roman" w:hAnsi="Times New Roman"/>
-                <w:b w:val="false"/>
-                <w:bCs w:val="false"/>
-                <w:i w:val="false"/>
-                <w:iCs w:val="false"/>
-                <w:sz w:val="22"/>
-                <w:szCs w:val="22"/>
-              </w:rPr>
-              <w:t xml:space="preserve">Pejabat Pembuat Komitmen</w:t>
-            </w:r>
-          </w:p>
-        </w:tc>
-        <w:tc>
-          <w:tcPr>
-            <w:tcW w:type="dxa" w:w="5366"/>
-            <w:tcBorders>
-              <w:top w:val="single" w:color="000000" w:sz="4"/>
-              <w:left w:val="single" w:color="000000" w:sz="4"/>
-              <w:bottom w:val="single" w:color="000000" w:sz="4"/>
-              <w:right w:val="single" w:color="000000" w:sz="4"/>
-            </w:tcBorders>
-            <w:tcMar>
-              <w:top w:type="dxa" w:w="60"/>
-              <w:left w:type="dxa" w:w="120"/>
-              <w:bottom w:type="dxa" w:w="60"/>
-              <w:right w:type="dxa" w:w="120"/>
-            </w:tcMar>
-          </w:tcPr>
-          <w:p>
-            <w:pPr>
-              <w:spacing w:after="0" w:before="0" w:line="360"/>
-              <w:jc w:val="left"/>
-            </w:pPr>
-            <w:r>
-              <w:rPr>
-                <w:rFonts w:ascii="Times New Roman" w:cs="Times New Roman" w:eastAsia="Times New Roman" w:hAnsi="Times New Roman"/>
-                <w:b w:val="false"/>
-                <w:bCs w:val="false"/>
-                <w:i w:val="false"/>
-                <w:iCs w:val="false"/>
-                <w:sz w:val="22"/>
-                <w:szCs w:val="22"/>
-              </w:rPr>
-              <w:t xml:space="preserve">Penanggung jawab komitmen pengadaan Belanja Modal; touchpoint utama kontrak, BAST, dan SPP-LS</w:t>
-            </w:r>
-          </w:p>
-        </w:tc>
-      </w:tr>
-      <w:tr>
-        <w:tc>
-          <w:tcPr>
-            <w:tcW w:type="dxa" w:w="800"/>
-            <w:tcBorders>
-              <w:top w:val="single" w:color="000000" w:sz="4"/>
-              <w:left w:val="single" w:color="000000" w:sz="4"/>
-              <w:bottom w:val="single" w:color="000000" w:sz="4"/>
-              <w:right w:val="single" w:color="000000" w:sz="4"/>
-            </w:tcBorders>
-            <w:tcMar>
-              <w:top w:type="dxa" w:w="60"/>
-              <w:left w:type="dxa" w:w="120"/>
-              <w:bottom w:type="dxa" w:w="60"/>
-              <w:right w:type="dxa" w:w="120"/>
-            </w:tcMar>
-          </w:tcPr>
-          <w:p>
-            <w:pPr>
-              <w:spacing w:after="0" w:before="0" w:line="360"/>
-              <w:jc w:val="left"/>
-            </w:pPr>
-            <w:r>
-              <w:rPr>
-                <w:rFonts w:ascii="Times New Roman" w:cs="Times New Roman" w:eastAsia="Times New Roman" w:hAnsi="Times New Roman"/>
-                <w:b w:val="false"/>
-                <w:bCs w:val="false"/>
-                <w:i w:val="false"/>
-                <w:iCs w:val="false"/>
-                <w:sz w:val="22"/>
-                <w:szCs w:val="22"/>
-              </w:rPr>
-              <w:t xml:space="preserve">PPSPM</w:t>
-            </w:r>
-          </w:p>
-        </w:tc>
-        <w:tc>
-          <w:tcPr>
-            <w:tcW w:type="dxa" w:w="2500"/>
-            <w:tcBorders>
-              <w:top w:val="single" w:color="000000" w:sz="4"/>
-              <w:left w:val="single" w:color="000000" w:sz="4"/>
-              <w:bottom w:val="single" w:color="000000" w:sz="4"/>
-              <w:right w:val="single" w:color="000000" w:sz="4"/>
-            </w:tcBorders>
-            <w:tcMar>
-              <w:top w:type="dxa" w:w="60"/>
-              <w:left w:type="dxa" w:w="120"/>
-              <w:bottom w:type="dxa" w:w="60"/>
-              <w:right w:type="dxa" w:w="120"/>
-            </w:tcMar>
-          </w:tcPr>
-          <w:p>
-            <w:pPr>
-              <w:spacing w:after="0" w:before="0" w:line="360"/>
-              <w:jc w:val="left"/>
-            </w:pPr>
-            <w:r>
-              <w:rPr>
-                <w:rFonts w:ascii="Times New Roman" w:cs="Times New Roman" w:eastAsia="Times New Roman" w:hAnsi="Times New Roman"/>
-                <w:b w:val="false"/>
-                <w:bCs w:val="false"/>
-                <w:i w:val="false"/>
-                <w:iCs w:val="false"/>
-                <w:sz w:val="22"/>
-                <w:szCs w:val="22"/>
-              </w:rPr>
-              <w:t xml:space="preserve">Pejabat Penandatangan SPM</w:t>
-            </w:r>
-          </w:p>
-        </w:tc>
-        <w:tc>
-          <w:tcPr>
-            <w:tcW w:type="dxa" w:w="5366"/>
-            <w:tcBorders>
-              <w:top w:val="single" w:color="000000" w:sz="4"/>
-              <w:left w:val="single" w:color="000000" w:sz="4"/>
-              <w:bottom w:val="single" w:color="000000" w:sz="4"/>
-              <w:right w:val="single" w:color="000000" w:sz="4"/>
-            </w:tcBorders>
-            <w:tcMar>
-              <w:top w:type="dxa" w:w="60"/>
-              <w:left w:type="dxa" w:w="120"/>
-              <w:bottom w:type="dxa" w:w="60"/>
-              <w:right w:type="dxa" w:w="120"/>
-            </w:tcMar>
-          </w:tcPr>
-          <w:p>
-            <w:pPr>
-              <w:spacing w:after="0" w:before="0" w:line="360"/>
-              <w:jc w:val="left"/>
-            </w:pPr>
-            <w:r>
-              <w:rPr>
-                <w:rFonts w:ascii="Times New Roman" w:cs="Times New Roman" w:eastAsia="Times New Roman" w:hAnsi="Times New Roman"/>
-                <w:b w:val="false"/>
-                <w:bCs w:val="false"/>
-                <w:i w:val="false"/>
-                <w:iCs w:val="false"/>
-                <w:sz w:val="22"/>
-                <w:szCs w:val="22"/>
-              </w:rPr>
-              <w:t xml:space="preserve">Penanggung jawab pencairan dana; verifikasi SPM; touchpoint teknis SAKTI/OM-SPAN</w:t>
-            </w:r>
-          </w:p>
-        </w:tc>
-      </w:tr>
-      <w:tr>
-        <w:tc>
-          <w:tcPr>
-            <w:tcW w:type="dxa" w:w="800"/>
-            <w:tcBorders>
-              <w:top w:val="single" w:color="000000" w:sz="4"/>
-              <w:left w:val="single" w:color="000000" w:sz="4"/>
-              <w:bottom w:val="single" w:color="000000" w:sz="4"/>
-              <w:right w:val="single" w:color="000000" w:sz="4"/>
-            </w:tcBorders>
-            <w:tcMar>
-              <w:top w:type="dxa" w:w="60"/>
-              <w:left w:type="dxa" w:w="120"/>
-              <w:bottom w:type="dxa" w:w="60"/>
-              <w:right w:type="dxa" w:w="120"/>
-            </w:tcMar>
-          </w:tcPr>
-          <w:p>
-            <w:pPr>
-              <w:spacing w:after="0" w:before="0" w:line="360"/>
-              <w:jc w:val="left"/>
-            </w:pPr>
-            <w:r>
-              <w:rPr>
-                <w:rFonts w:ascii="Times New Roman" w:cs="Times New Roman" w:eastAsia="Times New Roman" w:hAnsi="Times New Roman"/>
-                <w:b w:val="false"/>
-                <w:bCs w:val="false"/>
-                <w:i w:val="false"/>
-                <w:iCs w:val="false"/>
-                <w:sz w:val="22"/>
-                <w:szCs w:val="22"/>
-              </w:rPr>
-              <w:t xml:space="preserve">BPG</w:t>
-            </w:r>
-          </w:p>
-        </w:tc>
-        <w:tc>
-          <w:tcPr>
-            <w:tcW w:type="dxa" w:w="2500"/>
-            <w:tcBorders>
-              <w:top w:val="single" w:color="000000" w:sz="4"/>
-              <w:left w:val="single" w:color="000000" w:sz="4"/>
-              <w:bottom w:val="single" w:color="000000" w:sz="4"/>
-              <w:right w:val="single" w:color="000000" w:sz="4"/>
-            </w:tcBorders>
-            <w:tcMar>
-              <w:top w:type="dxa" w:w="60"/>
-              <w:left w:type="dxa" w:w="120"/>
-              <w:bottom w:type="dxa" w:w="60"/>
-              <w:right w:type="dxa" w:w="120"/>
-            </w:tcMar>
-          </w:tcPr>
-          <w:p>
-            <w:pPr>
-              <w:spacing w:after="0" w:before="0" w:line="360"/>
-              <w:jc w:val="left"/>
-            </w:pPr>
-            <w:r>
-              <w:rPr>
-                <w:rFonts w:ascii="Times New Roman" w:cs="Times New Roman" w:eastAsia="Times New Roman" w:hAnsi="Times New Roman"/>
-                <w:b w:val="false"/>
-                <w:bCs w:val="false"/>
-                <w:i w:val="false"/>
-                <w:iCs w:val="false"/>
-                <w:sz w:val="22"/>
-                <w:szCs w:val="22"/>
-              </w:rPr>
-              <w:t xml:space="preserve">Bendahara Pengeluaran</w:t>
-            </w:r>
-          </w:p>
-        </w:tc>
-        <w:tc>
-          <w:tcPr>
-            <w:tcW w:type="dxa" w:w="5366"/>
-            <w:tcBorders>
-              <w:top w:val="single" w:color="000000" w:sz="4"/>
-              <w:left w:val="single" w:color="000000" w:sz="4"/>
-              <w:bottom w:val="single" w:color="000000" w:sz="4"/>
-              <w:right w:val="single" w:color="000000" w:sz="4"/>
-            </w:tcBorders>
-            <w:tcMar>
-              <w:top w:type="dxa" w:w="60"/>
-              <w:left w:type="dxa" w:w="120"/>
-              <w:bottom w:type="dxa" w:w="60"/>
-              <w:right w:type="dxa" w:w="120"/>
-            </w:tcMar>
-          </w:tcPr>
-          <w:p>
-            <w:pPr>
-              <w:spacing w:after="0" w:before="0" w:line="360"/>
-              <w:jc w:val="left"/>
-            </w:pPr>
-            <w:r>
-              <w:rPr>
-                <w:rFonts w:ascii="Times New Roman" w:cs="Times New Roman" w:eastAsia="Times New Roman" w:hAnsi="Times New Roman"/>
-                <w:b w:val="false"/>
-                <w:bCs w:val="false"/>
-                <w:i w:val="false"/>
-                <w:iCs w:val="false"/>
-                <w:sz w:val="22"/>
-                <w:szCs w:val="22"/>
-              </w:rPr>
-              <w:t xml:space="preserve">Pelaksana operasional kas; akses penuh realisasi harian; perspektif teknis-operasional</w:t>
-            </w:r>
-          </w:p>
-        </w:tc>
-      </w:tr>
-      <w:tr>
-        <w:tc>
-          <w:tcPr>
-            <w:tcW w:type="dxa" w:w="800"/>
-            <w:tcBorders>
-              <w:top w:val="single" w:color="000000" w:sz="4"/>
-              <w:left w:val="single" w:color="000000" w:sz="4"/>
-              <w:bottom w:val="single" w:color="000000" w:sz="4"/>
-              <w:right w:val="single" w:color="000000" w:sz="4"/>
-            </w:tcBorders>
-            <w:tcMar>
-              <w:top w:type="dxa" w:w="60"/>
-              <w:left w:type="dxa" w:w="120"/>
-              <w:bottom w:type="dxa" w:w="60"/>
-              <w:right w:type="dxa" w:w="120"/>
-            </w:tcMar>
-          </w:tcPr>
-          <w:p>
-            <w:pPr>
-              <w:spacing w:after="0" w:before="0" w:line="360"/>
-              <w:jc w:val="left"/>
-            </w:pPr>
-            <w:r>
-              <w:rPr>
-                <w:rFonts w:ascii="Times New Roman" w:cs="Times New Roman" w:eastAsia="Times New Roman" w:hAnsi="Times New Roman"/>
-                <w:b w:val="false"/>
-                <w:bCs w:val="false"/>
-                <w:i w:val="false"/>
-                <w:iCs w:val="false"/>
-                <w:sz w:val="22"/>
-                <w:szCs w:val="22"/>
-              </w:rPr>
-              <w:t xml:space="preserve">SRKA</w:t>
-            </w:r>
-          </w:p>
-        </w:tc>
-        <w:tc>
-          <w:tcPr>
-            <w:tcW w:type="dxa" w:w="2500"/>
-            <w:tcBorders>
-              <w:top w:val="single" w:color="000000" w:sz="4"/>
-              <w:left w:val="single" w:color="000000" w:sz="4"/>
-              <w:bottom w:val="single" w:color="000000" w:sz="4"/>
-              <w:right w:val="single" w:color="000000" w:sz="4"/>
-            </w:tcBorders>
-            <w:tcMar>
-              <w:top w:type="dxa" w:w="60"/>
-              <w:left w:type="dxa" w:w="120"/>
-              <w:bottom w:type="dxa" w:w="60"/>
-              <w:right w:type="dxa" w:w="120"/>
-            </w:tcMar>
-          </w:tcPr>
-          <w:p>
-            <w:pPr>
-              <w:spacing w:after="0" w:before="0" w:line="360"/>
-              <w:jc w:val="left"/>
-            </w:pPr>
-            <w:r>
-              <w:rPr>
-                <w:rFonts w:ascii="Times New Roman" w:cs="Times New Roman" w:eastAsia="Times New Roman" w:hAnsi="Times New Roman"/>
-                <w:b w:val="false"/>
-                <w:bCs w:val="false"/>
-                <w:i w:val="false"/>
-                <w:iCs w:val="false"/>
-                <w:sz w:val="22"/>
-                <w:szCs w:val="22"/>
-              </w:rPr>
-              <w:t xml:space="preserve">Staf Penyusun Rencana Kerja dan Anggaran</w:t>
-            </w:r>
-          </w:p>
-        </w:tc>
-        <w:tc>
-          <w:tcPr>
-            <w:tcW w:type="dxa" w:w="5366"/>
-            <w:tcBorders>
-              <w:top w:val="single" w:color="000000" w:sz="4"/>
-              <w:left w:val="single" w:color="000000" w:sz="4"/>
-              <w:bottom w:val="single" w:color="000000" w:sz="4"/>
-              <w:right w:val="single" w:color="000000" w:sz="4"/>
-            </w:tcBorders>
-            <w:tcMar>
-              <w:top w:type="dxa" w:w="60"/>
-              <w:left w:type="dxa" w:w="120"/>
-              <w:bottom w:type="dxa" w:w="60"/>
-              <w:right w:type="dxa" w:w="120"/>
-            </w:tcMar>
-          </w:tcPr>
-          <w:p>
-            <w:pPr>
-              <w:spacing w:after="0" w:before="0" w:line="360"/>
-              <w:jc w:val="left"/>
-            </w:pPr>
-            <w:r>
-              <w:rPr>
-                <w:rFonts w:ascii="Times New Roman" w:cs="Times New Roman" w:eastAsia="Times New Roman" w:hAnsi="Times New Roman"/>
-                <w:b w:val="false"/>
-                <w:bCs w:val="false"/>
-                <w:i w:val="false"/>
-                <w:iCs w:val="false"/>
-                <w:sz w:val="22"/>
-                <w:szCs w:val="22"/>
-              </w:rPr>
-              <w:t xml:space="preserve">Pelaksana teknis penyusunan RPD bulanan; touchpoint perencanaan anggaran</w:t>
-            </w:r>
-          </w:p>
-        </w:tc>
-      </w:tr>
-      <w:tr>
-        <w:tc>
-          <w:tcPr>
-            <w:tcW w:type="dxa" w:w="800"/>
-            <w:tcBorders>
-              <w:top w:val="single" w:color="000000" w:sz="4"/>
-              <w:left w:val="single" w:color="000000" w:sz="4"/>
-              <w:bottom w:val="single" w:color="000000" w:sz="4"/>
-              <w:right w:val="single" w:color="000000" w:sz="4"/>
-            </w:tcBorders>
-            <w:tcMar>
-              <w:top w:type="dxa" w:w="60"/>
-              <w:left w:type="dxa" w:w="120"/>
-              <w:bottom w:type="dxa" w:w="60"/>
-              <w:right w:type="dxa" w:w="120"/>
-            </w:tcMar>
-          </w:tcPr>
-          <w:p>
-            <w:pPr>
-              <w:spacing w:after="0" w:before="0" w:line="360"/>
-              <w:jc w:val="left"/>
-            </w:pPr>
-            <w:r>
-              <w:rPr>
-                <w:rFonts w:ascii="Times New Roman" w:cs="Times New Roman" w:eastAsia="Times New Roman" w:hAnsi="Times New Roman"/>
-                <w:b w:val="false"/>
-                <w:bCs w:val="false"/>
-                <w:i w:val="false"/>
-                <w:iCs w:val="false"/>
-                <w:sz w:val="22"/>
-                <w:szCs w:val="22"/>
-              </w:rPr>
-              <w:t xml:space="preserve">PBJ</w:t>
-            </w:r>
-          </w:p>
-        </w:tc>
-        <w:tc>
-          <w:tcPr>
-            <w:tcW w:type="dxa" w:w="2500"/>
-            <w:tcBorders>
-              <w:top w:val="single" w:color="000000" w:sz="4"/>
-              <w:left w:val="single" w:color="000000" w:sz="4"/>
-              <w:bottom w:val="single" w:color="000000" w:sz="4"/>
-              <w:right w:val="single" w:color="000000" w:sz="4"/>
-            </w:tcBorders>
-            <w:tcMar>
-              <w:top w:type="dxa" w:w="60"/>
-              <w:left w:type="dxa" w:w="120"/>
-              <w:bottom w:type="dxa" w:w="60"/>
-              <w:right w:type="dxa" w:w="120"/>
-            </w:tcMar>
-          </w:tcPr>
-          <w:p>
-            <w:pPr>
-              <w:spacing w:after="0" w:before="0" w:line="360"/>
-              <w:jc w:val="left"/>
-            </w:pPr>
-            <w:r>
-              <w:rPr>
-                <w:rFonts w:ascii="Times New Roman" w:cs="Times New Roman" w:eastAsia="Times New Roman" w:hAnsi="Times New Roman"/>
-                <w:b w:val="false"/>
-                <w:bCs w:val="false"/>
-                <w:i w:val="false"/>
-                <w:iCs w:val="false"/>
-                <w:sz w:val="22"/>
-                <w:szCs w:val="22"/>
-              </w:rPr>
-              <w:t xml:space="preserve">Pejabat Pengadaan/Pejabat Fungsional Pengadaan Barang/Jasa</w:t>
-            </w:r>
-          </w:p>
-        </w:tc>
-        <w:tc>
-          <w:tcPr>
-            <w:tcW w:type="dxa" w:w="5366"/>
-            <w:tcBorders>
-              <w:top w:val="single" w:color="000000" w:sz="4"/>
-              <w:left w:val="single" w:color="000000" w:sz="4"/>
-              <w:bottom w:val="single" w:color="000000" w:sz="4"/>
-              <w:right w:val="single" w:color="000000" w:sz="4"/>
-            </w:tcBorders>
-            <w:tcMar>
-              <w:top w:type="dxa" w:w="60"/>
-              <w:left w:type="dxa" w:w="120"/>
-              <w:bottom w:type="dxa" w:w="60"/>
-              <w:right w:type="dxa" w:w="120"/>
-            </w:tcMar>
-          </w:tcPr>
-          <w:p>
-            <w:pPr>
-              <w:spacing w:after="0" w:before="0" w:line="360"/>
-              <w:jc w:val="left"/>
-            </w:pPr>
-            <w:r>
-              <w:rPr>
-                <w:rFonts w:ascii="Times New Roman" w:cs="Times New Roman" w:eastAsia="Times New Roman" w:hAnsi="Times New Roman"/>
-                <w:b w:val="false"/>
-                <w:bCs w:val="false"/>
-                <w:i w:val="false"/>
-                <w:iCs w:val="false"/>
-                <w:sz w:val="22"/>
-                <w:szCs w:val="22"/>
-              </w:rPr>
-              <w:t xml:space="preserve">Pelaksana pemilihan penyedia untuk paket Belanja Modal; perspektif operasional pengadaan</w:t>
-            </w:r>
-          </w:p>
-        </w:tc>
-      </w:tr>
-    </w:tbl>
-    <w:p>
-      <w:pPr>
-        <w:spacing w:after="240" w:before="80" w:line="480"/>
-        <w:jc w:val="left"/>
-      </w:pPr>
-      <w:r>
-        <w:rPr>
-          <w:rFonts w:ascii="Times New Roman" w:cs="Times New Roman" w:eastAsia="Times New Roman" w:hAnsi="Times New Roman"/>
-          <w:i/>
-          <w:iCs/>
-          <w:sz w:val="22"/>
-          <w:szCs w:val="22"/>
-        </w:rPr>
-        <w:t xml:space="preserve">Sumber: Disusun berdasarkan struktur organisasi pengelola keuangan dan pengadaan Rudenim Pontianak.</w:t>
+        <w:t xml:space="preserve">3.2.2  Studi Dokumentasi</w:t>
       </w:r>
     </w:p>
     <w:p>
@@ -13887,32 +13123,13 @@
           <w:sz w:val="24"/>
           <w:szCs w:val="24"/>
         </w:rPr>
-        <w:t xml:space="preserve">Secara operasional, pelaksanaan wawancara mendalam dilakukan secara semi-terstruktur dengan durasi berkisar antara 60 hingga 90 menit per sesi. Wawancara diselenggarakan di ruang tertutup pada kantor Rudenim Pontianak atau lokasi alternatif lain demi kenyamanan informan. Seluruh proses wawancara direkam menggunakan alat perekam audio atas persetujuan tertulis dari informan. Rekaman audio tersebut kemudian ditranskripsikan secara verbatim dalam Bahasa Indonesia dengan tetap mempertahankan istilah-istilah teknis penganggaran. Sebagai bentuk verifikasi keabsahan data (Lincoln &amp; Guba, 1985), transkrip hasil wawancara dikirimkan kembali kepada informan dalam waktu tujuh hari untuk dilakukan pengecekan ulang dan konfirmasi kebenarannya (</w:t>
-      </w:r>
-      <w:r>
-        <w:rPr>
-          <w:rFonts w:ascii="Times New Roman" w:cs="Times New Roman" w:eastAsia="Times New Roman" w:hAnsi="Times New Roman"/>
-          <w:i/>
-          <w:iCs/>
-          <w:sz w:val="24"/>
-          <w:szCs w:val="24"/>
-        </w:rPr>
-        <w:t xml:space="preserve">member check</w:t>
-      </w:r>
-      <w:r>
-        <w:rPr>
-          <w:rFonts w:ascii="Times New Roman" w:cs="Times New Roman" w:eastAsia="Times New Roman" w:hAnsi="Times New Roman"/>
-          <w:sz w:val="24"/>
-          <w:szCs w:val="24"/>
-        </w:rPr>
-        <w:t xml:space="preserve">).</w:t>
-      </w:r>
-    </w:p>
-    <w:p>
-      <w:pPr>
-        <w:pStyle w:val="Heading3"/>
-        <w:spacing w:after="160" w:before="240" w:line="480"/>
-        <w:jc w:val="left"/>
+        <w:t xml:space="preserve">Studi dokumentasi dilaksanakan sebagai teknik pengumpulan data sekunder yang berfungsi sebagai bukti objektif yang dapat diverifikasi secara sistem. Apabila narasi informan dalam wawancara berkesesuaian dengan data dalam dokumen, keyakinan atas temuan meningkat; apabila terdapat inkonsistensi, hal tersebut menjadi bahan klarifikasi pada wawancara lanjutan. Untuk memastikan keaslian dan kredibilitas, peneliti mengutamakan dokumen yang memiliki tanda tangan digital BSrE/BSSN atau dokumen yang ditarik langsung dari sistem OM-SPAN dan SAKTI yang teraudit. Daftar dokumen yang akan diakses disajikan pada Tabel 3.2.</w:t>
+      </w:r>
+    </w:p>
+    <w:p>
+      <w:pPr>
+        <w:spacing w:after="80" w:before="240" w:line="480"/>
+        <w:jc w:val="center"/>
       </w:pPr>
       <w:r>
         <w:rPr>
@@ -13922,38 +13139,7 @@
           <w:sz w:val="24"/>
           <w:szCs w:val="24"/>
         </w:rPr>
-        <w:t xml:space="preserve">3.2.2  Studi Dokumentasi</w:t>
-      </w:r>
-    </w:p>
-    <w:p>
-      <w:pPr>
-        <w:spacing w:after="0" w:before="0" w:line="480"/>
-        <w:ind w:firstLine="709"/>
-        <w:jc w:val="both"/>
-      </w:pPr>
-      <w:r>
-        <w:rPr>
-          <w:rFonts w:ascii="Times New Roman" w:cs="Times New Roman" w:eastAsia="Times New Roman" w:hAnsi="Times New Roman"/>
-          <w:sz w:val="24"/>
-          <w:szCs w:val="24"/>
-        </w:rPr>
-        <w:t xml:space="preserve">Studi dokumentasi dilaksanakan sebagai teknik pengumpulan data sekunder yang berfungsi sebagai bukti objektif yang dapat diverifikasi secara sistem. Apabila narasi informan dalam wawancara berkesesuaian dengan data dalam dokumen, keyakinan atas temuan meningkat; apabila terdapat inkonsistensi, hal tersebut menjadi bahan klarifikasi pada wawancara lanjutan. Untuk memastikan keaslian dan kredibilitas, peneliti mengutamakan dokumen yang memiliki tanda tangan digital BSrE/BSSN atau dokumen yang ditarik langsung dari sistem OM-SPAN dan SAKTI yang teraudit. Daftar dokumen yang akan diakses disajikan pada Tabel 3.1.</w:t>
-      </w:r>
-    </w:p>
-    <w:p>
-      <w:pPr>
-        <w:spacing w:after="80" w:before="240" w:line="480"/>
-        <w:jc w:val="center"/>
-      </w:pPr>
-      <w:r>
-        <w:rPr>
-          <w:rFonts w:ascii="Times New Roman" w:cs="Times New Roman" w:eastAsia="Times New Roman" w:hAnsi="Times New Roman"/>
-          <w:b/>
-          <w:bCs/>
-          <w:sz w:val="24"/>
-          <w:szCs w:val="24"/>
-        </w:rPr>
-        <w:t xml:space="preserve">Tabel 3.1 Daftar Dokumen Studi Dokumentasi</w:t>
+        <w:t xml:space="preserve">Tabel 3.2 Daftar Dokumen Studi Dokumentasi</w:t>
       </w:r>
     </w:p>
     <w:tbl>
@@ -14255,7 +13441,7 @@
                 <w:sz w:val="22"/>
                 <w:szCs w:val="22"/>
               </w:rPr>
-              <w:t xml:space="preserve">Laporan IKPA per semester (OM-SPAN/MEBE)</w:t>
+              <w:t xml:space="preserve">Laporan IKPA per semester (OM-SPAN/MEBE - Monitoring and Evaluation of Budget Execution)</w:t>
             </w:r>
           </w:p>
         </w:tc>
@@ -15674,7 +14860,25 @@
           <w:sz w:val="24"/>
           <w:szCs w:val="24"/>
         </w:rPr>
-        <w:t xml:space="preserve"> [Working paper]. University of Geneva.</w:t>
+        <w:t xml:space="preserve"> [</w:t>
+      </w:r>
+      <w:r>
+        <w:rPr>
+          <w:rFonts w:ascii="Times New Roman" w:cs="Times New Roman" w:eastAsia="Times New Roman" w:hAnsi="Times New Roman"/>
+          <w:i/>
+          <w:iCs/>
+          <w:sz w:val="24"/>
+          <w:szCs w:val="24"/>
+        </w:rPr>
+        <w:t xml:space="preserve">Working paper</w:t>
+      </w:r>
+      <w:r>
+        <w:rPr>
+          <w:rFonts w:ascii="Times New Roman" w:cs="Times New Roman" w:eastAsia="Times New Roman" w:hAnsi="Times New Roman"/>
+          <w:sz w:val="24"/>
+          <w:szCs w:val="24"/>
+        </w:rPr>
+        <w:t xml:space="preserve">]. University of Geneva.</w:t>
       </w:r>
     </w:p>
     <w:p>

</xml_diff>